<commit_message>
Add author metadata to CRM submission package
</commit_message>
<xml_diff>
--- a/manuscript/CRM_MANUSCRIPT_v1.1.docx
+++ b/manuscript/CRM_MANUSCRIPT_v1.1.docx
@@ -17,7 +17,7 @@
     </w:p>
     <w:p>
       <w:r>
-        <w:t>Generated: 2026-08-30 14:00:36 UTC</w:t>
+        <w:t>Generated: 2026-08-30 14:05:25 UTC</w:t>
       </w:r>
     </w:p>
     <w:p>
@@ -30,17 +30,22 @@
     </w:p>
     <w:p>
       <w:r>
-        <w:t>Authors: [To be completed]</w:t>
+        <w:t>Authors: Da Lin1, Ying Chen2, Yue Liu2, Yu Zhang1</w:t>
       </w:r>
     </w:p>
     <w:p>
       <w:r>
-        <w:t>Affiliations: [To be completed]</w:t>
+        <w:t>Affiliations: 1 Department of Ophthalmology, The Second Affiliated Hospital of Wenzhou Medical University, No. 109 Xueyuan West Road, Lucheng District, Wenzhou, Zhejiang Province, China</w:t>
       </w:r>
     </w:p>
     <w:p>
       <w:r>
-        <w:t>Correspondence: [To be completed]</w:t>
+        <w:t>2 Wenzhou Medical University, Wenzhou, Zhejiang Province, China</w:t>
+      </w:r>
+    </w:p>
+    <w:p>
+      <w:r>
+        <w:t>Correspondence: Yu Zhang, zhangyu1@wzhealth.com; ORCID: 0000-0001-8579-3692</w:t>
       </w:r>
     </w:p>
     <w:p>

</xml_diff>